<commit_message>
rearrange bio page for core certifications and awards at bottom and set to be larger
</commit_message>
<xml_diff>
--- a/static/uploads/Isaac_Neibaur_resume.docx
+++ b/static/uploads/Isaac_Neibaur_resume.docx
@@ -358,15 +358,31 @@
           <w:sz w:val="22"/>
           <w:szCs w:val="22"/>
         </w:rPr>
-        <w:t xml:space="preserve"> and administrated</w:t>
-      </w:r>
-      <w:r>
-        <w:rPr>
-          <w:rFonts w:ascii="Calibri" w:hAnsi="Calibri" w:cs="Calibri"/>
-          <w:sz w:val="22"/>
-          <w:szCs w:val="22"/>
-        </w:rPr>
-        <w:t xml:space="preserve"> reporting workflows using GitHub Actions</w:t>
+        <w:t xml:space="preserve"> and </w:t>
+      </w:r>
+      <w:r>
+        <w:rPr>
+          <w:rFonts w:ascii="Calibri" w:hAnsi="Calibri" w:cs="Calibri"/>
+          <w:sz w:val="22"/>
+          <w:szCs w:val="22"/>
+        </w:rPr>
+        <w:t>administered</w:t>
+      </w:r>
+      <w:r>
+        <w:rPr>
+          <w:rFonts w:ascii="Calibri" w:hAnsi="Calibri" w:cs="Calibri"/>
+          <w:sz w:val="22"/>
+          <w:szCs w:val="22"/>
+        </w:rPr>
+        <w:t xml:space="preserve"> </w:t>
+      </w:r>
+      <w:r>
+        <w:rPr>
+          <w:rFonts w:ascii="Calibri" w:hAnsi="Calibri" w:cs="Calibri"/>
+          <w:sz w:val="22"/>
+          <w:szCs w:val="22"/>
+        </w:rPr>
+        <w:t>reporting workflows using GitHub Actions</w:t>
       </w:r>
       <w:r>
         <w:rPr>
@@ -436,7 +452,7 @@
           <w:sz w:val="22"/>
           <w:szCs w:val="22"/>
         </w:rPr>
-        <w:t xml:space="preserve">Led a small group for two years covering </w:t>
+        <w:t xml:space="preserve">Led a two-year security-focused learning group covering DevOps security topics, including </w:t>
       </w:r>
       <w:proofErr w:type="spellStart"/>
       <w:r>
@@ -445,7 +461,7 @@
           <w:sz w:val="22"/>
           <w:szCs w:val="22"/>
         </w:rPr>
-        <w:t>devOps</w:t>
+        <w:t>PortSwigger</w:t>
       </w:r>
       <w:proofErr w:type="spellEnd"/>
       <w:r>
@@ -454,7 +470,7 @@
           <w:sz w:val="22"/>
           <w:szCs w:val="22"/>
         </w:rPr>
-        <w:t xml:space="preserve"> security topics and </w:t>
+        <w:t xml:space="preserve"> and </w:t>
       </w:r>
       <w:proofErr w:type="spellStart"/>
       <w:r>
@@ -463,7 +479,7 @@
           <w:sz w:val="22"/>
           <w:szCs w:val="22"/>
         </w:rPr>
-        <w:t>Portswigger</w:t>
+        <w:t>TryHackMe</w:t>
       </w:r>
       <w:proofErr w:type="spellEnd"/>
       <w:r>
@@ -472,59 +488,23 @@
           <w:sz w:val="22"/>
           <w:szCs w:val="22"/>
         </w:rPr>
-        <w:t xml:space="preserve"> and </w:t>
-      </w:r>
-      <w:proofErr w:type="spellStart"/>
-      <w:r>
-        <w:rPr>
-          <w:rFonts w:ascii="Calibri" w:hAnsi="Calibri" w:cs="Calibri"/>
-          <w:sz w:val="22"/>
-          <w:szCs w:val="22"/>
-        </w:rPr>
-        <w:t>TryHackMe</w:t>
-      </w:r>
-      <w:proofErr w:type="spellEnd"/>
-      <w:r>
-        <w:rPr>
-          <w:rFonts w:ascii="Calibri" w:hAnsi="Calibri" w:cs="Calibri"/>
-          <w:sz w:val="22"/>
-          <w:szCs w:val="22"/>
-        </w:rPr>
-        <w:t xml:space="preserve"> labs as well as competing and placing in </w:t>
-      </w:r>
-      <w:r>
-        <w:rPr>
-          <w:rFonts w:ascii="Calibri" w:hAnsi="Calibri" w:cs="Calibri"/>
-          <w:sz w:val="22"/>
-          <w:szCs w:val="22"/>
-        </w:rPr>
-        <w:t>companywide</w:t>
-      </w:r>
-      <w:r>
-        <w:rPr>
-          <w:rFonts w:ascii="Calibri" w:hAnsi="Calibri" w:cs="Calibri"/>
-          <w:sz w:val="22"/>
-          <w:szCs w:val="22"/>
-        </w:rPr>
-        <w:t xml:space="preserve"> competitions in </w:t>
-      </w:r>
-      <w:proofErr w:type="spellStart"/>
-      <w:r>
-        <w:rPr>
-          <w:rFonts w:ascii="Calibri" w:hAnsi="Calibri" w:cs="Calibri"/>
-          <w:sz w:val="22"/>
-          <w:szCs w:val="22"/>
-        </w:rPr>
-        <w:t>SecureCodeWarrior</w:t>
-      </w:r>
-      <w:proofErr w:type="spellEnd"/>
-      <w:r>
-        <w:rPr>
-          <w:rFonts w:ascii="Calibri" w:hAnsi="Calibri" w:cs="Calibri"/>
-          <w:sz w:val="22"/>
-          <w:szCs w:val="22"/>
-        </w:rPr>
-        <w:t>.</w:t>
+        <w:t xml:space="preserve"> labs, and participated </w:t>
+      </w:r>
+      <w:r>
+        <w:rPr>
+          <w:rFonts w:ascii="Calibri" w:hAnsi="Calibri" w:cs="Calibri"/>
+          <w:sz w:val="22"/>
+          <w:szCs w:val="22"/>
+        </w:rPr>
+        <w:t xml:space="preserve">and consistently ranked well </w:t>
+      </w:r>
+      <w:r>
+        <w:rPr>
+          <w:rFonts w:ascii="Calibri" w:hAnsi="Calibri" w:cs="Calibri"/>
+          <w:sz w:val="22"/>
+          <w:szCs w:val="22"/>
+        </w:rPr>
+        <w:t>in company-wide Secure Code Warrior competitions.</w:t>
       </w:r>
     </w:p>
     <w:p>
@@ -651,25 +631,23 @@
           <w:sz w:val="22"/>
           <w:szCs w:val="22"/>
         </w:rPr>
-        <w:t xml:space="preserve">Worked with VP to build out and improve on our client facing phone tree as well as </w:t>
-      </w:r>
-      <w:proofErr w:type="gramStart"/>
-      <w:r>
-        <w:rPr>
-          <w:rFonts w:ascii="Calibri" w:hAnsi="Calibri" w:cs="Calibri"/>
-          <w:sz w:val="22"/>
-          <w:szCs w:val="22"/>
-        </w:rPr>
-        <w:t>built</w:t>
-      </w:r>
-      <w:proofErr w:type="gramEnd"/>
-      <w:r>
-        <w:rPr>
-          <w:rFonts w:ascii="Calibri" w:hAnsi="Calibri" w:cs="Calibri"/>
-          <w:sz w:val="22"/>
-          <w:szCs w:val="22"/>
-        </w:rPr>
-        <w:t xml:space="preserve"> dashboards and reports providing leadership insights into call volumes and other metrics</w:t>
+        <w:t xml:space="preserve">Worked with </w:t>
+      </w:r>
+      <w:r>
+        <w:rPr>
+          <w:rFonts w:ascii="Calibri" w:hAnsi="Calibri" w:cs="Calibri"/>
+          <w:sz w:val="22"/>
+          <w:szCs w:val="22"/>
+        </w:rPr>
+        <w:t xml:space="preserve">a </w:t>
+      </w:r>
+      <w:r>
+        <w:rPr>
+          <w:rFonts w:ascii="Calibri" w:hAnsi="Calibri" w:cs="Calibri"/>
+          <w:sz w:val="22"/>
+          <w:szCs w:val="22"/>
+        </w:rPr>
+        <w:t>VP to build out and improve on our client facing phone tree as well as built dashboards and reports providing leadership insights into call volumes and other metrics</w:t>
       </w:r>
       <w:r>
         <w:rPr>
@@ -700,15 +678,7 @@
           <w:sz w:val="22"/>
           <w:szCs w:val="22"/>
         </w:rPr>
-        <w:t>On my own time I built and a way to generate quotes in our system with Postman and to bind and test quotes with Python and Selenium for robust testing and automation</w:t>
-      </w:r>
-      <w:r>
-        <w:rPr>
-          <w:rFonts w:ascii="Calibri" w:hAnsi="Calibri" w:cs="Calibri"/>
-          <w:sz w:val="22"/>
-          <w:szCs w:val="22"/>
-        </w:rPr>
-        <w:t>.</w:t>
+        <w:t>On my own time, I built a solution to generate quotes via Postman and automated quote binding/testing using Python and Selenium.</w:t>
       </w:r>
     </w:p>
     <w:p>
@@ -950,7 +920,15 @@
           <w:sz w:val="22"/>
           <w:szCs w:val="22"/>
         </w:rPr>
-        <w:t xml:space="preserve"> that researchers could use to print bar code labels for their petri dishes vs the original hand and paper excel method</w:t>
+        <w:t xml:space="preserve"> that researchers could use to print barcode labels for their petri dishes vs the original </w:t>
+      </w:r>
+      <w:r>
+        <w:rPr>
+          <w:rFonts w:ascii="Calibri" w:hAnsi="Calibri" w:cs="Calibri"/>
+          <w:sz w:val="22"/>
+          <w:szCs w:val="22"/>
+        </w:rPr>
+        <w:t>manual Excel-based process</w:t>
       </w:r>
       <w:r>
         <w:rPr>
@@ -1212,7 +1190,7 @@
 <w:hdr xmlns:wpc="http://schemas.microsoft.com/office/word/2010/wordprocessingCanvas" xmlns:cx="http://schemas.microsoft.com/office/drawing/2014/chartex" xmlns:cx1="http://schemas.microsoft.com/office/drawing/2015/9/8/chartex" xmlns:cx2="http://schemas.microsoft.com/office/drawing/2015/10/21/chartex" xmlns:cx3="http://schemas.microsoft.com/office/drawing/2016/5/9/chartex" xmlns:cx4="http://schemas.microsoft.com/office/drawing/2016/5/10/chartex" xmlns:cx5="http://schemas.microsoft.com/office/drawing/2016/5/11/chartex" xmlns:cx6="http://schemas.microsoft.com/office/drawing/2016/5/12/chartex" xmlns:cx7="http://schemas.microsoft.com/office/drawing/2016/5/13/chartex" xmlns:cx8="http://schemas.microsoft.com/office/drawing/2016/5/14/chartex" xmlns:mc="http://schemas.openxmlformats.org/markup-compatibility/2006" xmlns:aink="http://schemas.microsoft.com/office/drawing/2016/ink" xmlns:am3d="http://schemas.microsoft.com/office/drawing/2017/model3d" xmlns:o="urn:schemas-microsoft-com:office:office" xmlns:oel="http://schemas.microsoft.com/office/2019/extlst" xmlns:r="http://schemas.openxmlformats.org/officeDocument/2006/relationships" xmlns:m="http://schemas.openxmlformats.org/officeDocument/2006/math" xmlns:v="urn:schemas-microsoft-com:vml" xmlns:wp14="http://schemas.microsoft.com/office/word/2010/wordprocessingDrawing" xmlns:wp="http://schemas.openxmlformats.org/drawingml/2006/wordprocessingDrawing" xmlns:w10="urn:schemas-microsoft-com:office:word" xmlns:w="http://schemas.openxmlformats.org/wordprocessingml/2006/main" xmlns:w14="http://schemas.microsoft.com/office/word/2010/wordml" xmlns:w15="http://schemas.microsoft.com/office/word/2012/wordml" xmlns:w16cex="http://schemas.microsoft.com/office/word/2018/wordml/cex" xmlns:w16cid="http://schemas.microsoft.com/office/word/2016/wordml/cid" xmlns:w16="http://schemas.microsoft.com/office/word/2018/wordml" xmlns:w16du="http://schemas.microsoft.com/office/word/2023/wordml/word16du" xmlns:w16sdtdh="http://schemas.microsoft.com/office/word/2020/wordml/sdtdatahash" xmlns:w16sdtfl="http://schemas.microsoft.com/office/word/2024/wordml/sdtformatlock" xmlns:w16se="http://schemas.microsoft.com/office/word/2015/wordml/symex" xmlns:wpg="http://schemas.microsoft.com/office/word/2010/wordprocessingGroup" xmlns:wpi="http://schemas.microsoft.com/office/word/2010/wordprocessingInk" xmlns:wne="http://schemas.microsoft.com/office/word/2006/wordml" xmlns:wps="http://schemas.microsoft.com/office/word/2010/wordprocessingShape" mc:Ignorable="w14 w15 w16se w16cid w16 w16cex w16sdtdh w16sdtfl w16du wp14">
   <w:p>
     <w:pPr>
-      <w:spacing w:after="0" w:line="240" w:lineRule="auto"/>
+      <w:spacing w:after="0"/>
       <w:jc w:val="center"/>
     </w:pPr>
     <w:r>
@@ -1239,7 +1217,7 @@
   </w:p>
   <w:p>
     <w:pPr>
-      <w:spacing w:after="0" w:line="240" w:lineRule="auto"/>
+      <w:spacing w:after="0"/>
       <w:jc w:val="center"/>
     </w:pPr>
     <w:r>
@@ -1984,7 +1962,6 @@
   <w:style w:type="character" w:default="1" w:styleId="DefaultParagraphFont">
     <w:name w:val="Default Paragraph Font"/>
     <w:uiPriority w:val="1"/>
-    <w:semiHidden/>
     <w:unhideWhenUsed/>
   </w:style>
   <w:style w:type="table" w:default="1" w:styleId="TableNormal">

</xml_diff>